<commit_message>
Clarify annual plan eligibility
</commit_message>
<xml_diff>
--- a/public/campanha-namorados/regulamento-dia-dos-namorados-dial-fit.docx
+++ b/public/campanha-namorados/regulamento-dia-dos-namorados-dial-fit.docx
@@ -189,7 +189,7 @@
         <w:jc w:val="center"/>
       </w:pPr>
       <w:r>
-        <w:t>Versão 1.0 - publicação em 27/05/2026</w:t>
+        <w:t>Versão 1.1 - atualização em 01/06/2026</w:t>
       </w:r>
     </w:p>
     <w:p>
@@ -494,14 +494,8 @@
             <w:vAlign w:val="center"/>
           </w:tcPr>
           <w:p>
-            <w:pPr>
-              <w:spacing w:before="40" w:after="40"/>
-            </w:pPr>
             <w:r>
-              <w:rPr>
-                <w:sz w:val="18"/>
-              </w:rPr>
-              <w:t>Alunos ativos da Dial Fit/Dial Beach, com cadastro validado pela organização</w:t>
+              <w:t>Alunos ativos dos planos anuais da Dial Fit: plano anual ou anual recorrente. Plano mensal não participa.</w:t>
             </w:r>
           </w:p>
         </w:tc>
@@ -689,7 +683,7 @@
         <w:spacing w:after="120" w:line="259" w:lineRule="auto"/>
       </w:pPr>
       <w:r>
-        <w:t>A campanha tem como objetivo promover uma ação especial de relacionamento com alunos ativos da Dial Fit/Dial Beach em comemoração ao Dia dos Namorados, por meio de cadastro digital para participação em sorteio de jantares especiais para 2 casais vencedores.</w:t>
+        <w:t>A campanha tem como objetivo promover uma ação especial de relacionamento com alunos ativos dos planos anuais da Dial Fit, incluindo plano anual e plano anual recorrente, em comemoração ao Dia dos Namorados, por meio de cadastro digital para participação em sorteio de jantares especiais para 2 casais vencedores. Alunos de plano mensal não participam da campanha.</w:t>
       </w:r>
     </w:p>
     <w:p>
@@ -742,7 +736,7 @@
         <w:spacing w:after="60"/>
       </w:pPr>
       <w:r>
-        <w:t>Poderão participar alunos ativos da Dial Fit/Dial Beach, com cadastro regular na academia no momento da inscrição e na data de validação da participação.</w:t>
+        <w:t>Poderão participar somente alunos ativos da Dial Fit vinculados aos planos anuais elegíveis: plano anual ou plano anual recorrente. Alunos de plano mensal, planos avulsos, diárias, experimentais ou qualquer modalidade não anual não participam desta campanha.</w:t>
       </w:r>
     </w:p>
     <w:p>
@@ -763,7 +757,7 @@
         <w:spacing w:after="60"/>
       </w:pPr>
       <w:r>
-        <w:t>O participante poderá indicar um acompanhante. O acompanhante não precisa ser aluno da Dial Fit/Dial Beach.</w:t>
+        <w:t>O participante poderá indicar um acompanhante. O acompanhante não precisa ser aluno da Dial Fit.</w:t>
       </w:r>
     </w:p>
     <w:p>
@@ -872,11 +866,9 @@
         <w:spacing w:after="120" w:line="259" w:lineRule="auto"/>
       </w:pPr>
       <w:r>
-        <w:t>A inscrição somente será considerada válida após o envio do formulário e a validação do aluno como ativo na base da ac</w:t>
+        <w:t>A inscrição somente será considerada válida após o envio do formulário e a validação do aluno como ativo em plano anual ou anual recorrente na base da academia.</w:t>
       </w:r>
-      <w:r>
-        <w:t>ademia.</w:t>
-      </w:r>
+      <w:r/>
     </w:p>
     <w:p>
       <w:pPr>
@@ -895,7 +887,7 @@
         <w:spacing w:after="120" w:line="259" w:lineRule="auto"/>
       </w:pPr>
       <w:r>
-        <w:t>Durante o fluxo de cadastro, a Realizadora disponibilizará links oficiais para que os participantes deixem uma avaliação sincera sobre sua experiência com a Dial Fit e/ou Dial Beach no Google Maps.</w:t>
+        <w:t>Durante o fluxo de cadastro, a Realizadora disponibilizará link oficial para que os participantes deixem uma avaliação sincera sobre sua experiência com a Dial Fit no Google Maps.</w:t>
       </w:r>
     </w:p>
     <w:p>
@@ -919,35 +911,8 @@
         <w:spacing w:after="40"/>
       </w:pPr>
       <w:r>
-        <w:rPr>
-          <w:b/>
-        </w:rPr>
-        <w:t xml:space="preserve">Links oficiais de avaliação: </w:t>
+        <w:t>Link oficial de avaliação: Avaliar Dial Fit</w:t>
       </w:r>
-      <w:hyperlink r:id="rId10">
-        <w:r>
-          <w:rPr>
-            <w:color w:val="0563C1"/>
-            <w:u w:val="single"/>
-          </w:rPr>
-          <w:t>Avaliar Dial Fit</w:t>
-        </w:r>
-      </w:hyperlink>
-      <w:r>
-        <w:rPr>
-          <w:color w:val="475569"/>
-        </w:rPr>
-        <w:t xml:space="preserve"> | </w:t>
-      </w:r>
-      <w:hyperlink r:id="rId11">
-        <w:r>
-          <w:rPr>
-            <w:color w:val="0563C1"/>
-            <w:u w:val="single"/>
-          </w:rPr>
-          <w:t>Avaliar Dial Beach</w:t>
-        </w:r>
-      </w:hyperlink>
     </w:p>
     <w:p>
       <w:pPr>
@@ -1043,7 +1008,7 @@
         <w:spacing w:after="120" w:line="259" w:lineRule="auto"/>
       </w:pPr>
       <w:r>
-        <w:t>A organização poderá validar os dados informados pelo participante, incluindo nome, e-mail, telefone, CPF ou matrícula, unidade e situação de aluno ativo.</w:t>
+        <w:t>A organização poderá validar os dados informados pelo participante, incluindo nome, e-mail, telefone, CPF ou matrícula, plano contratado e situação de aluno ativo em plano anual ou anual recorrente.</w:t>
       </w:r>
     </w:p>
     <w:p>
@@ -1051,11 +1016,9 @@
         <w:spacing w:after="120" w:line="259" w:lineRule="auto"/>
       </w:pPr>
       <w:r>
-        <w:t>Caso sejam identificadas inconsis</w:t>
+        <w:t>Caso sejam identificadas inconsistências, dados incompletos, duplicidade, tentativa de fraude, ausência de vínculo ativo com a academia ou plano mensal/não elegível, a inscrição poderá ser considerada inválida.</w:t>
       </w:r>
-      <w:r>
-        <w:t>tências, dados incompletos, duplicidade, tentativa de fraude ou ausência de vínculo ativo com a academia, a inscrição poderá ser considerada inválida.</w:t>
-      </w:r>
+      <w:r/>
     </w:p>
     <w:p>
       <w:pPr>
@@ -1113,7 +1076,7 @@
         <w:spacing w:after="120" w:line="259" w:lineRule="auto"/>
       </w:pPr>
       <w:r>
-        <w:t>O resultado poderá ser divulgado no site oficial da campanha, no Instagram, WhatsApp, recepção da academia e demais canais oficiais da Dial Fit/Dial Beach.</w:t>
+        <w:t>O resultado poderá ser divulgado no site oficial da campanha, no Instagram, WhatsApp, recepção da academia e demais canais oficiais da Dial Fit.</w:t>
       </w:r>
     </w:p>
     <w:p>
@@ -1176,11 +1139,9 @@
         <w:spacing w:after="60"/>
       </w:pPr>
       <w:r>
-        <w:t>não forem alunos ativos no momento da v</w:t>
+        <w:t>não forem alunos ativos de plano anual ou anual recorrente no momento da validação;</w:t>
       </w:r>
-      <w:r>
-        <w:t>alidação;</w:t>
-      </w:r>
+      <w:r/>
     </w:p>
     <w:p>
       <w:pPr>
@@ -1262,11 +1223,9 @@
         <w:spacing w:after="120" w:line="259" w:lineRule="auto"/>
       </w:pPr>
       <w:r>
-        <w:t>Poderão ser coletados dados como nome, e-mail, telefone, CPF ou matrícula, unidade, nome e contato do acompanhante, aceite do regulamento, data e hora de inscrição e</w:t>
+        <w:t>Poderão ser coletados dados como nome, e-mail, telefone, CPF ou matrícula, plano contratado, nome e contato do acompanhante, aceite do regulamento, data e hora de inscrição e status de validação.</w:t>
       </w:r>
-      <w:r>
-        <w:t xml:space="preserve"> status de validação.</w:t>
-      </w:r>
+      <w:r/>
     </w:p>
     <w:p>
       <w:pPr>
@@ -1304,10 +1263,7 @@
         <w:spacing w:after="120" w:line="259" w:lineRule="auto"/>
       </w:pPr>
       <w:r>
-        <w:t>O aceite eletrônico poderá registrar data, horário, e-ma</w:t>
-      </w:r>
-      <w:r>
-        <w:t>il utilizado, versão do regulamento e demais informações técnicas necessárias para comprovação interna da participação.</w:t>
+        <w:t>O aceite eletrônico poderá registrar data, horário, e-mail utilizado, versão do regulamento e demais informações técnicas necessárias para comprovação interna da participação. Ao aceitar o regulamento, o participante declara estar ciente de que a campanha é exclusiva para alunos ativos dos planos anual ou anual recorrente, e que plano mensal não participa.</w:t>
       </w:r>
     </w:p>
     <w:p>
@@ -1438,7 +1394,7 @@
     <w:p>
       <w:pPr/>
       <w:r>
-        <w:t>Demais comunicados poderão ser divulgados no Instagram, WhatsApp, recepção da academia e demais canais oficiais da Dial Fit/Dial Beach.</w:t>
+        <w:t>Demais comunicados poderão ser divulgados no Instagram, WhatsApp, recepção da academia e demais canais oficiais da Dial Fit.</w:t>
       </w:r>
     </w:p>
     <w:sectPr>

</xml_diff>